<commit_message>
add media to header section
</commit_message>
<xml_diff>
--- a/Технічне_завдання_на_вакансію_HTML_верстальник.docx
+++ b/Технічне_завдання_на_вакансію_HTML_верстальник.docx
@@ -267,29 +267,17 @@
         <w:ind w:left="357" w:hanging="357"/>
         <w:rPr>
           <w:color w:val="000000"/>
-          <w:lang w:val="uk-UA"/>
-        </w:rPr>
-      </w:pPr>
-      <w:r>
-        <w:rPr>
-          <w:color w:val="000000"/>
-          <w:lang w:val="uk-UA"/>
-        </w:rPr>
-        <w:t xml:space="preserve">Зверстати </w:t>
-      </w:r>
-      <w:r>
-        <w:rPr>
-          <w:color w:val="000000"/>
-          <w:lang w:val="uk-UA"/>
-        </w:rPr>
-        <w:t xml:space="preserve">десктопну </w:t>
-      </w:r>
-      <w:r>
-        <w:rPr>
-          <w:color w:val="000000"/>
-          <w:lang w:val="uk-UA"/>
-        </w:rPr>
-        <w:t>версію в точності як на макеті.</w:t>
+          <w:highlight w:val="lightGray"/>
+          <w:lang w:val="uk-UA"/>
+        </w:rPr>
+      </w:pPr>
+      <w:r>
+        <w:rPr>
+          <w:color w:val="000000"/>
+          <w:highlight w:val="lightGray"/>
+          <w:lang w:val="uk-UA"/>
+        </w:rPr>
+        <w:t>Зверстати десктопну версію в точності як на макеті.</w:t>
       </w:r>
     </w:p>
     <w:p>
@@ -303,29 +291,17 @@
         <w:ind w:left="357" w:hanging="357"/>
         <w:rPr>
           <w:color w:val="000000"/>
-          <w:lang w:val="uk-UA"/>
-        </w:rPr>
-      </w:pPr>
-      <w:r>
-        <w:rPr>
-          <w:color w:val="000000"/>
-          <w:lang w:val="uk-UA"/>
-        </w:rPr>
-        <w:t xml:space="preserve">На </w:t>
-      </w:r>
-      <w:r>
-        <w:rPr>
-          <w:color w:val="000000"/>
-          <w:lang w:val="uk-UA"/>
-        </w:rPr>
-        <w:t>десктопн</w:t>
-      </w:r>
-      <w:r>
-        <w:rPr>
-          <w:color w:val="000000"/>
-          <w:lang w:val="uk-UA"/>
-        </w:rPr>
-        <w:t>ій версії додати плавні ховери на кнопки.</w:t>
+          <w:highlight w:val="lightGray"/>
+          <w:lang w:val="uk-UA"/>
+        </w:rPr>
+      </w:pPr>
+      <w:r>
+        <w:rPr>
+          <w:color w:val="000000"/>
+          <w:highlight w:val="lightGray"/>
+          <w:lang w:val="uk-UA"/>
+        </w:rPr>
+        <w:t>На десктопній версії додати плавні ховери на кнопки.</w:t>
       </w:r>
     </w:p>
     <w:p>
@@ -339,36 +315,17 @@
         <w:ind w:left="357" w:hanging="357"/>
         <w:rPr>
           <w:color w:val="000000"/>
-          <w:lang w:val="uk-UA"/>
-        </w:rPr>
-      </w:pPr>
-      <w:r>
-        <w:rPr>
-          <w:color w:val="000000"/>
-          <w:lang w:val="uk-UA"/>
-        </w:rPr>
-        <w:t>Використовувати flex і grid там, де вважає</w:t>
-      </w:r>
-      <w:r>
-        <w:rPr>
-          <w:color w:val="000000"/>
-          <w:lang w:val="uk-UA"/>
-        </w:rPr>
-        <w:t>те</w:t>
-      </w:r>
-      <w:r>
-        <w:rPr>
-          <w:color w:val="000000"/>
-          <w:lang w:val="uk-UA"/>
-        </w:rPr>
-        <w:t xml:space="preserve"> за потрібне</w:t>
-      </w:r>
-      <w:r>
-        <w:rPr>
-          <w:color w:val="000000"/>
-          <w:lang w:val="uk-UA"/>
-        </w:rPr>
-        <w:t xml:space="preserve">. </w:t>
+          <w:highlight w:val="lightGray"/>
+          <w:lang w:val="uk-UA"/>
+        </w:rPr>
+      </w:pPr>
+      <w:r>
+        <w:rPr>
+          <w:color w:val="000000"/>
+          <w:highlight w:val="lightGray"/>
+          <w:lang w:val="uk-UA"/>
+        </w:rPr>
+        <w:t xml:space="preserve">Використовувати flex і grid там, де вважаєте за потрібне. </w:t>
       </w:r>
     </w:p>
     <w:p>
@@ -692,18 +649,21 @@
         <w:ind w:left="357" w:hanging="357"/>
         <w:rPr>
           <w:color w:val="000000"/>
-          <w:lang w:val="uk-UA"/>
-        </w:rPr>
-      </w:pPr>
-      <w:r>
-        <w:rPr>
-          <w:color w:val="000000"/>
+          <w:highlight w:val="lightGray"/>
+          <w:lang w:val="uk-UA"/>
+        </w:rPr>
+      </w:pPr>
+      <w:r>
+        <w:rPr>
+          <w:color w:val="000000"/>
+          <w:highlight w:val="lightGray"/>
         </w:rPr>
         <w:t>Використовувати методолог</w:t>
       </w:r>
       <w:r>
         <w:rPr>
           <w:color w:val="000000"/>
+          <w:highlight w:val="lightGray"/>
           <w:lang w:val="uk-UA"/>
         </w:rPr>
         <w:t xml:space="preserve">ію БЄМ для написання </w:t>
@@ -711,6 +671,7 @@
       <w:r>
         <w:rPr>
           <w:color w:val="000000"/>
+          <w:highlight w:val="lightGray"/>
           <w:lang w:val="en-US"/>
         </w:rPr>
         <w:t>css</w:t>
@@ -718,12 +679,14 @@
       <w:r>
         <w:rPr>
           <w:color w:val="000000"/>
+          <w:highlight w:val="lightGray"/>
         </w:rPr>
         <w:t xml:space="preserve">, </w:t>
       </w:r>
       <w:r>
         <w:rPr>
           <w:color w:val="000000"/>
+          <w:highlight w:val="lightGray"/>
           <w:lang w:val="en-US"/>
         </w:rPr>
         <w:t>sass</w:t>
@@ -731,12 +694,14 @@
       <w:r>
         <w:rPr>
           <w:color w:val="000000"/>
+          <w:highlight w:val="lightGray"/>
         </w:rPr>
         <w:t xml:space="preserve"> </w:t>
       </w:r>
       <w:r>
         <w:rPr>
           <w:color w:val="000000"/>
+          <w:highlight w:val="lightGray"/>
           <w:lang w:val="uk-UA"/>
         </w:rPr>
         <w:t>стилів.</w:t>

</xml_diff>